<commit_message>
removes imaging ref from document example
</commit_message>
<xml_diff>
--- a/document/chart/output.docx
+++ b/document/chart/output.docx
@@ -15,13 +15,13 @@
             </wp:positionV>
             <wp:extent cx="1828800" cy="1828800"/>
             <wp:wrapSquare wrapText="bothSides"/>
-            <wp:docPr id="1333872972" name="Chart"/>
+            <wp:docPr id="1623775447" name="Chart"/>
             <wp:cNvGraphicFramePr/>
             <a:graphic xmlns:a="http://schemas.openxmlformats.org/drawingml/2006/main">
               <a:graphicData uri="http://schemas.openxmlformats.org/drawingml/2006/picture">
                 <pic:pic xmlns="http://schemas.openxmlformats.org/drawingml/2006/picture" xmlns:pic="http://schemas.openxmlformats.org/drawingml/2006/picture" xmlns:xml="http://www.w3.org/XML/1998/namespace">
                   <pic:nvPicPr>
-                    <pic:cNvPr id="1333872972" name="" descr="Chart"/>
+                    <pic:cNvPr id="1623775447" name="" descr="Chart"/>
                     <pic:cNvPicPr/>
                   </pic:nvPicPr>
                   <pic:blipFill>

</xml_diff>